<commit_message>
Remove duplicate Part C block and fix event source in Q3
Co-Authored-By: Claude Opus 5.5 <noreply@anthropic.com>
</commit_message>
<xml_diff>
--- a/Naomi Hofman.docx
+++ b/Naomi Hofman.docx
@@ -9940,7 +9940,7 @@
           <w:sz w:val="24"/>
           <w:szCs w:val="24"/>
         </w:rPr>
-        <w:t xml:space="preserve"> מכיוון שמערכת המסרים (למשל </w:t>
+        <w:t xml:space="preserve"> מכיוון ששדירת המידע</w:t>
       </w:r>
       <w:proofErr w:type="spellStart"/>
       <w:r>
@@ -9950,7 +9950,6 @@
           <w:sz w:val="24"/>
           <w:szCs w:val="24"/>
         </w:rPr>
-        <w:t>SignalR</w:t>
       </w:r>
       <w:proofErr w:type="spellEnd"/>
       <w:r>
@@ -9960,7 +9959,7 @@
           <w:sz w:val="24"/>
           <w:szCs w:val="24"/>
         </w:rPr>
-        <w:t xml:space="preserve">) מספקת </w:t>
+        <w:t xml:space="preserve"> מספקת </w:t>
       </w:r>
       <w:proofErr w:type="spellStart"/>
       <w:r>
@@ -10953,923 +10952,6 @@
       <w:pPr>
         <w:bidi/>
       </w:pPr>
-    </w:p>
-    <w:p>
-      <w:pPr>
-        <w:pStyle w:val="2"/>
-        <w:bidi/>
-        <w:spacing w:before="180" w:after="80"/>
-      </w:pPr>
-      <w:r>
-        <w:t>1. הגנה על מידע אישי (PII)</w:t>
-      </w:r>
-    </w:p>
-    <w:p>
-      <w:pPr>
-        <w:pStyle w:val="a3"/>
-        <w:numPr>
-          <w:ilvl w:val="0"/>
-          <w:numId w:val="2"/>
-        </w:numPr>
-        <w:bidi/>
-        <w:spacing w:after="40"/>
-      </w:pPr>
-      <w:r>
-        <w:t xml:space="preserve">הזהות רק </w:t>
-      </w:r>
-      <w:proofErr w:type="spellStart"/>
-      <w:r>
-        <w:t>מ</w:t>
-      </w:r>
-      <w:r>
-        <w:t>Claim</w:t>
-      </w:r>
-      <w:proofErr w:type="spellEnd"/>
-      <w:r>
-        <w:t xml:space="preserve"> בטוקן מאומת; </w:t>
-      </w:r>
-      <w:proofErr w:type="spellStart"/>
-      <w:r>
-        <w:t>ה</w:t>
-      </w:r>
-      <w:r>
-        <w:t>DTO</w:t>
-      </w:r>
-      <w:proofErr w:type="spellEnd"/>
-      <w:r>
-        <w:t xml:space="preserve"> היוצא הוא </w:t>
-      </w:r>
-      <w:proofErr w:type="spellStart"/>
-      <w:r>
-        <w:t>whitelist</w:t>
-      </w:r>
-      <w:proofErr w:type="spellEnd"/>
-      <w:r>
-        <w:t xml:space="preserve"> ללא ת"ז (נבדק בבדיקת יחידה).</w:t>
-      </w:r>
-    </w:p>
-    <w:p>
-      <w:pPr>
-        <w:pStyle w:val="a3"/>
-        <w:numPr>
-          <w:ilvl w:val="0"/>
-          <w:numId w:val="2"/>
-        </w:numPr>
-        <w:bidi/>
-        <w:spacing w:after="40"/>
-      </w:pPr>
-      <w:r>
-        <w:t xml:space="preserve">לוגים מובנים: רק </w:t>
-      </w:r>
-      <w:proofErr w:type="spellStart"/>
-      <w:r>
-        <w:t>requestId</w:t>
-      </w:r>
-      <w:proofErr w:type="spellEnd"/>
-      <w:r>
-        <w:t xml:space="preserve">, טופס, רשות וסטטוס </w:t>
-      </w:r>
-      <w:r>
-        <w:t>-</w:t>
-      </w:r>
-      <w:r>
-        <w:t xml:space="preserve">ללא ת"ז או טוקן; </w:t>
-      </w:r>
-      <w:proofErr w:type="spellStart"/>
-      <w:r>
-        <w:t>Retention</w:t>
-      </w:r>
-      <w:proofErr w:type="spellEnd"/>
-      <w:r>
-        <w:t xml:space="preserve"> מוגבל.</w:t>
-      </w:r>
-    </w:p>
-    <w:p>
-      <w:pPr>
-        <w:pStyle w:val="a3"/>
-        <w:numPr>
-          <w:ilvl w:val="0"/>
-          <w:numId w:val="2"/>
-        </w:numPr>
-        <w:bidi/>
-        <w:spacing w:after="40"/>
-      </w:pPr>
-      <w:r>
-        <w:t>בין שירותים: TLS/</w:t>
-      </w:r>
-      <w:proofErr w:type="spellStart"/>
-      <w:r>
-        <w:t>mTLS</w:t>
-      </w:r>
-      <w:proofErr w:type="spellEnd"/>
-      <w:r>
-        <w:t xml:space="preserve"> והרשאת </w:t>
-      </w:r>
-      <w:proofErr w:type="spellStart"/>
-      <w:r>
-        <w:t>service</w:t>
-      </w:r>
-      <w:r>
-        <w:t>to</w:t>
-      </w:r>
-      <w:r>
-        <w:t>service</w:t>
-      </w:r>
-      <w:proofErr w:type="spellEnd"/>
-      <w:r>
-        <w:t xml:space="preserve">; </w:t>
-      </w:r>
-      <w:proofErr w:type="spellStart"/>
-      <w:r>
-        <w:t>הת"ז</w:t>
-      </w:r>
-      <w:proofErr w:type="spellEnd"/>
-      <w:r>
-        <w:t xml:space="preserve"> נשלחת </w:t>
-      </w:r>
-      <w:proofErr w:type="spellStart"/>
-      <w:r>
-        <w:t>ב</w:t>
-      </w:r>
-      <w:r>
-        <w:t>Header</w:t>
-      </w:r>
-      <w:proofErr w:type="spellEnd"/>
-      <w:r>
-        <w:t>/</w:t>
-      </w:r>
-      <w:proofErr w:type="spellStart"/>
-      <w:r>
-        <w:t>Body</w:t>
-      </w:r>
-      <w:proofErr w:type="spellEnd"/>
-      <w:r>
-        <w:t xml:space="preserve"> ולא </w:t>
-      </w:r>
-      <w:proofErr w:type="spellStart"/>
-      <w:r>
-        <w:t>ב</w:t>
-      </w:r>
-      <w:r>
-        <w:t>URL</w:t>
-      </w:r>
-      <w:proofErr w:type="spellEnd"/>
-      <w:r>
-        <w:t>.</w:t>
-      </w:r>
-    </w:p>
-    <w:p>
-      <w:pPr>
-        <w:pStyle w:val="a3"/>
-        <w:numPr>
-          <w:ilvl w:val="0"/>
-          <w:numId w:val="2"/>
-        </w:numPr>
-        <w:bidi/>
-        <w:spacing w:after="40"/>
-      </w:pPr>
-      <w:r>
-        <w:t>מיני</w:t>
-      </w:r>
-      <w:r>
-        <w:t xml:space="preserve">מום הרשאות, סודות </w:t>
-      </w:r>
-      <w:proofErr w:type="spellStart"/>
-      <w:r>
-        <w:t>ב</w:t>
-      </w:r>
-      <w:r>
-        <w:t>Key</w:t>
-      </w:r>
-      <w:proofErr w:type="spellEnd"/>
-      <w:r>
-        <w:t xml:space="preserve"> </w:t>
-      </w:r>
-      <w:proofErr w:type="spellStart"/>
-      <w:r>
-        <w:t>Vault</w:t>
-      </w:r>
-      <w:proofErr w:type="spellEnd"/>
-      <w:r>
-        <w:t xml:space="preserve">, ואין PII </w:t>
-      </w:r>
-      <w:proofErr w:type="spellStart"/>
-      <w:r>
-        <w:t>ב</w:t>
-      </w:r>
-      <w:r>
-        <w:t>Cache</w:t>
-      </w:r>
-      <w:proofErr w:type="spellEnd"/>
-      <w:r>
-        <w:t xml:space="preserve"> משותף.</w:t>
-      </w:r>
-    </w:p>
-    <w:p>
-      <w:pPr>
-        <w:pStyle w:val="2"/>
-        <w:bidi/>
-        <w:spacing w:before="180" w:after="80"/>
-      </w:pPr>
-      <w:r>
-        <w:t>2. תלות איטית או לא זמינה</w:t>
-      </w:r>
-    </w:p>
-    <w:p>
-      <w:pPr>
-        <w:pStyle w:val="a3"/>
-        <w:numPr>
-          <w:ilvl w:val="0"/>
-          <w:numId w:val="2"/>
-        </w:numPr>
-        <w:bidi/>
-        <w:spacing w:after="40"/>
-      </w:pPr>
-      <w:proofErr w:type="spellStart"/>
-      <w:r>
-        <w:t>HttpClient</w:t>
-      </w:r>
-      <w:proofErr w:type="spellEnd"/>
-      <w:r>
-        <w:t xml:space="preserve"> טיפוסי עם </w:t>
-      </w:r>
-      <w:proofErr w:type="spellStart"/>
-      <w:r>
-        <w:t>Resilience</w:t>
-      </w:r>
-      <w:proofErr w:type="spellEnd"/>
-      <w:r>
-        <w:t xml:space="preserve">: </w:t>
-      </w:r>
-      <w:proofErr w:type="spellStart"/>
-      <w:r>
-        <w:t>Timeout</w:t>
-      </w:r>
-      <w:proofErr w:type="spellEnd"/>
-      <w:r>
-        <w:t xml:space="preserve"> לכל ניסיון </w:t>
-      </w:r>
-      <w:proofErr w:type="spellStart"/>
-      <w:r>
-        <w:t>ו</w:t>
-      </w:r>
-      <w:r>
-        <w:t>Timeout</w:t>
-      </w:r>
-      <w:proofErr w:type="spellEnd"/>
-      <w:r>
-        <w:t xml:space="preserve"> כולל, </w:t>
-      </w:r>
-      <w:proofErr w:type="spellStart"/>
-      <w:r>
-        <w:t>Retry</w:t>
-      </w:r>
-      <w:proofErr w:type="spellEnd"/>
-      <w:r>
-        <w:t xml:space="preserve"> עם </w:t>
-      </w:r>
-      <w:proofErr w:type="spellStart"/>
-      <w:r>
-        <w:t>Backoff</w:t>
-      </w:r>
-      <w:proofErr w:type="spellEnd"/>
-      <w:r>
-        <w:t xml:space="preserve"> </w:t>
-      </w:r>
-      <w:proofErr w:type="spellStart"/>
-      <w:r>
-        <w:t>ו</w:t>
-      </w:r>
-      <w:r>
-        <w:t>Jitter</w:t>
-      </w:r>
-      <w:proofErr w:type="spellEnd"/>
-      <w:r>
-        <w:t xml:space="preserve"> רק </w:t>
-      </w:r>
-      <w:proofErr w:type="spellStart"/>
-      <w:r>
-        <w:t>ל</w:t>
-      </w:r>
-      <w:r>
-        <w:t>GET</w:t>
-      </w:r>
-      <w:proofErr w:type="spellEnd"/>
-      <w:r>
-        <w:t xml:space="preserve"> ולשגיאות חולפות, </w:t>
-      </w:r>
-      <w:proofErr w:type="spellStart"/>
-      <w:r>
-        <w:t>ו</w:t>
-      </w:r>
-      <w:r>
-        <w:t>Circuit</w:t>
-      </w:r>
-      <w:proofErr w:type="spellEnd"/>
-      <w:r>
-        <w:t xml:space="preserve"> </w:t>
-      </w:r>
-      <w:proofErr w:type="spellStart"/>
-      <w:r>
-        <w:t>Breaker</w:t>
-      </w:r>
-      <w:proofErr w:type="spellEnd"/>
-      <w:r>
-        <w:t xml:space="preserve"> שמחזיר כשל מהר.</w:t>
-      </w:r>
-    </w:p>
-    <w:p>
-      <w:pPr>
-        <w:pStyle w:val="a3"/>
-        <w:numPr>
-          <w:ilvl w:val="0"/>
-          <w:numId w:val="2"/>
-        </w:numPr>
-        <w:bidi/>
-        <w:spacing w:after="40"/>
-        <w:rPr>
-          <w:rtl w:val="0"/>
-        </w:rPr>
-      </w:pPr>
-      <w:r>
-        <w:t>הקטלוג משתנה לעתים רח</w:t>
-      </w:r>
-      <w:r>
-        <w:t xml:space="preserve">וקות: </w:t>
-      </w:r>
-      <w:proofErr w:type="spellStart"/>
-      <w:r>
-        <w:t>Cache</w:t>
-      </w:r>
-      <w:proofErr w:type="spellEnd"/>
-      <w:r>
-        <w:t xml:space="preserve"> בזיכרון ל</w:t>
-      </w:r>
-      <w:r>
-        <w:t>5</w:t>
-      </w:r>
-      <w:r>
-        <w:t>-</w:t>
-      </w:r>
-      <w:r>
-        <w:t>10 דקות, עם הגשת ערך</w:t>
-      </w:r>
-    </w:p>
-    <w:p>
-      <w:pPr>
-        <w:pStyle w:val="a3"/>
-        <w:bidi/>
-        <w:spacing w:after="40"/>
-        <w:ind w:left="360"/>
-      </w:pPr>
-      <w:r>
-        <w:t xml:space="preserve"> ישן בזמן תקלה.</w:t>
-      </w:r>
-    </w:p>
-    <w:p>
-      <w:pPr>
-        <w:pStyle w:val="a3"/>
-        <w:numPr>
-          <w:ilvl w:val="0"/>
-          <w:numId w:val="2"/>
-        </w:numPr>
-        <w:bidi/>
-        <w:spacing w:after="40"/>
-      </w:pPr>
-      <w:r>
-        <w:t xml:space="preserve">בקשות התושב לא נשמרות </w:t>
-      </w:r>
-      <w:proofErr w:type="spellStart"/>
-      <w:r>
-        <w:t>ב</w:t>
-      </w:r>
-      <w:r>
-        <w:t>Cache</w:t>
-      </w:r>
-      <w:proofErr w:type="spellEnd"/>
-      <w:r>
-        <w:t xml:space="preserve"> (PII, ועדכניות חשובה).</w:t>
-      </w:r>
-    </w:p>
-    <w:p>
-      <w:pPr>
-        <w:pStyle w:val="a3"/>
-        <w:numPr>
-          <w:ilvl w:val="0"/>
-          <w:numId w:val="2"/>
-        </w:numPr>
-        <w:bidi/>
-        <w:spacing w:after="40"/>
-      </w:pPr>
-      <w:r>
-        <w:t xml:space="preserve">כשהתלות למטה מוחזר 503 עם </w:t>
-      </w:r>
-      <w:proofErr w:type="spellStart"/>
-      <w:r>
-        <w:t>ProblemDetails</w:t>
-      </w:r>
-      <w:proofErr w:type="spellEnd"/>
-      <w:r>
-        <w:t xml:space="preserve">, והרכיב מציג "נסו שוב" </w:t>
-      </w:r>
-      <w:r>
-        <w:t>-</w:t>
-      </w:r>
-      <w:r>
-        <w:t>לעולם לא רשימה ריקה.</w:t>
-      </w:r>
-    </w:p>
-    <w:p>
-      <w:pPr>
-        <w:pStyle w:val="2"/>
-        <w:bidi/>
-        <w:spacing w:before="180" w:after="80"/>
-      </w:pPr>
-      <w:r>
-        <w:t xml:space="preserve">3. אירועי שינוי סטטוס </w:t>
-      </w:r>
-      <w:proofErr w:type="spellStart"/>
-      <w:r>
-        <w:t>ו</w:t>
-      </w:r>
-      <w:r>
-        <w:t>Idempotency</w:t>
-      </w:r>
-      <w:proofErr w:type="spellEnd"/>
-    </w:p>
-    <w:p>
-      <w:pPr>
-        <w:pStyle w:val="a3"/>
-        <w:numPr>
-          <w:ilvl w:val="0"/>
-          <w:numId w:val="2"/>
-        </w:numPr>
-        <w:bidi/>
-        <w:spacing w:after="40"/>
-      </w:pPr>
-      <w:r>
-        <w:t>צרכן משדירת המידע מק</w:t>
-      </w:r>
-      <w:r>
-        <w:t>בל אירוע {</w:t>
-      </w:r>
-      <w:proofErr w:type="spellStart"/>
-      <w:r>
-        <w:t>eventId</w:t>
-      </w:r>
-      <w:proofErr w:type="spellEnd"/>
-      <w:r>
-        <w:t xml:space="preserve">, </w:t>
-      </w:r>
-      <w:proofErr w:type="spellStart"/>
-      <w:r>
-        <w:t>requestId</w:t>
-      </w:r>
-      <w:proofErr w:type="spellEnd"/>
-      <w:r>
-        <w:t xml:space="preserve">, </w:t>
-      </w:r>
-      <w:proofErr w:type="spellStart"/>
-      <w:r>
-        <w:t>statusCode</w:t>
-      </w:r>
-      <w:proofErr w:type="spellEnd"/>
-      <w:r>
-        <w:t xml:space="preserve">, </w:t>
-      </w:r>
-      <w:proofErr w:type="spellStart"/>
-      <w:r>
-        <w:t>occurredAt</w:t>
-      </w:r>
-      <w:proofErr w:type="spellEnd"/>
-      <w:r>
-        <w:t xml:space="preserve">} ומעדכן התראות או </w:t>
-      </w:r>
-      <w:proofErr w:type="spellStart"/>
-      <w:r>
-        <w:t>Read</w:t>
-      </w:r>
-      <w:r>
-        <w:t>model</w:t>
-      </w:r>
-      <w:proofErr w:type="spellEnd"/>
-      <w:r>
-        <w:t xml:space="preserve">, ובגרסה הבאה דוחף לרכיב (למשל </w:t>
-      </w:r>
-      <w:proofErr w:type="spellStart"/>
-      <w:r>
-        <w:t>SignalR</w:t>
-      </w:r>
-      <w:proofErr w:type="spellEnd"/>
-      <w:r>
-        <w:t>).</w:t>
-      </w:r>
-    </w:p>
-    <w:p>
-      <w:pPr>
-        <w:pStyle w:val="a3"/>
-        <w:numPr>
-          <w:ilvl w:val="0"/>
-          <w:numId w:val="2"/>
-        </w:numPr>
-        <w:bidi/>
-        <w:spacing w:after="40"/>
-      </w:pPr>
-      <w:proofErr w:type="spellStart"/>
-      <w:r>
-        <w:t>ה</w:t>
-      </w:r>
-      <w:r>
-        <w:t>Delivery</w:t>
-      </w:r>
-      <w:proofErr w:type="spellEnd"/>
-      <w:r>
-        <w:t xml:space="preserve"> הוא </w:t>
-      </w:r>
-      <w:proofErr w:type="spellStart"/>
-      <w:r>
-        <w:t>At</w:t>
-      </w:r>
-      <w:r>
-        <w:t>least</w:t>
-      </w:r>
-      <w:r>
-        <w:t>once</w:t>
-      </w:r>
-      <w:proofErr w:type="spellEnd"/>
-      <w:r>
-        <w:t xml:space="preserve">, לכן כל אירוע נרשם באוסף </w:t>
-      </w:r>
-      <w:proofErr w:type="spellStart"/>
-      <w:r>
-        <w:t>ProcessedEvents</w:t>
-      </w:r>
-      <w:proofErr w:type="spellEnd"/>
-      <w:r>
-        <w:t xml:space="preserve"> עם אינדקס ייחודי על </w:t>
-      </w:r>
-      <w:proofErr w:type="spellStart"/>
-      <w:r>
-        <w:t>eventId</w:t>
-      </w:r>
-      <w:proofErr w:type="spellEnd"/>
-      <w:r>
-        <w:t xml:space="preserve"> </w:t>
-      </w:r>
-      <w:proofErr w:type="spellStart"/>
-      <w:r>
-        <w:t>ו</w:t>
-      </w:r>
-      <w:r>
-        <w:t>TTL</w:t>
-      </w:r>
-      <w:proofErr w:type="spellEnd"/>
-      <w:r>
-        <w:t xml:space="preserve">. אירוע כפול נכשל </w:t>
-      </w:r>
-      <w:proofErr w:type="spellStart"/>
-      <w:r>
-        <w:t>ב</w:t>
-      </w:r>
-      <w:r>
-        <w:t>insert</w:t>
-      </w:r>
-      <w:proofErr w:type="spellEnd"/>
-      <w:r>
-        <w:t xml:space="preserve"> ומדו</w:t>
-      </w:r>
-      <w:r>
-        <w:t>לג.</w:t>
-      </w:r>
-    </w:p>
-    <w:p>
-      <w:pPr>
-        <w:pStyle w:val="a3"/>
-        <w:numPr>
-          <w:ilvl w:val="0"/>
-          <w:numId w:val="2"/>
-        </w:numPr>
-        <w:bidi/>
-        <w:spacing w:after="40"/>
-      </w:pPr>
-      <w:r>
-        <w:t xml:space="preserve">כדי להתמודד עם אירועים שמגיעים לא בסדר: עדכון רק אם </w:t>
-      </w:r>
-      <w:proofErr w:type="spellStart"/>
-      <w:r>
-        <w:t>occurredAt</w:t>
-      </w:r>
-      <w:proofErr w:type="spellEnd"/>
-      <w:r>
-        <w:t xml:space="preserve"> חדש מהקיים (עדכון מותנה).</w:t>
-      </w:r>
-    </w:p>
-    <w:p>
-      <w:pPr>
-        <w:pStyle w:val="2"/>
-        <w:bidi/>
-        <w:spacing w:before="180" w:after="80"/>
-      </w:pPr>
-      <w:r>
-        <w:t xml:space="preserve">4. אינדקסים </w:t>
-      </w:r>
-      <w:proofErr w:type="spellStart"/>
-      <w:r>
-        <w:t>ב</w:t>
-      </w:r>
-      <w:r>
-        <w:t>ServiceCatalog</w:t>
-      </w:r>
-      <w:proofErr w:type="spellEnd"/>
-      <w:r>
-        <w:t xml:space="preserve"> והעתקת בקשות</w:t>
-      </w:r>
-    </w:p>
-    <w:p>
-      <w:pPr>
-        <w:pStyle w:val="a3"/>
-        <w:numPr>
-          <w:ilvl w:val="0"/>
-          <w:numId w:val="2"/>
-        </w:numPr>
-        <w:bidi/>
-        <w:spacing w:after="40"/>
-      </w:pPr>
-      <w:r>
-        <w:t xml:space="preserve">אינדקס ייחודי על </w:t>
-      </w:r>
-      <w:proofErr w:type="spellStart"/>
-      <w:r>
-        <w:t>formCode</w:t>
-      </w:r>
-      <w:proofErr w:type="spellEnd"/>
-      <w:r>
-        <w:t xml:space="preserve"> </w:t>
-      </w:r>
-      <w:r>
-        <w:t>-</w:t>
-      </w:r>
-      <w:r>
-        <w:t>משרת את השאילתה היחידה ({</w:t>
-      </w:r>
-      <w:proofErr w:type="spellStart"/>
-      <w:r>
-        <w:t>formCode</w:t>
-      </w:r>
-      <w:proofErr w:type="spellEnd"/>
-      <w:r>
-        <w:t>: {$</w:t>
-      </w:r>
-      <w:proofErr w:type="spellStart"/>
-      <w:r>
-        <w:t>in</w:t>
-      </w:r>
-      <w:proofErr w:type="spellEnd"/>
-      <w:r>
-        <w:t>: [...]}}) ומונע כפילויות. הרשויות הן מפתחות במסמך, ול</w:t>
-      </w:r>
-      <w:r>
-        <w:t>כן לא נדרש אינדקס נוסף.</w:t>
-      </w:r>
-    </w:p>
-    <w:p>
-      <w:pPr>
-        <w:pStyle w:val="a3"/>
-        <w:numPr>
-          <w:ilvl w:val="0"/>
-          <w:numId w:val="2"/>
-        </w:numPr>
-        <w:bidi/>
-        <w:spacing w:after="40"/>
-      </w:pPr>
-      <w:r>
-        <w:t xml:space="preserve">העתקת הבקשות </w:t>
-      </w:r>
-      <w:proofErr w:type="spellStart"/>
-      <w:r>
-        <w:t>ל</w:t>
-      </w:r>
-      <w:r>
-        <w:t>Mongo</w:t>
-      </w:r>
-      <w:proofErr w:type="spellEnd"/>
-      <w:r>
-        <w:t xml:space="preserve"> תשפר מהירות וזמינות, אבל תשכפל PII, תדרוש סנכרון (אירועים) ותיצור סיכון לחוסר עקביות. מערכת הטפסים נשארת מקור האמת.</w:t>
-      </w:r>
-    </w:p>
-    <w:p>
-      <w:pPr>
-        <w:pStyle w:val="a3"/>
-        <w:numPr>
-          <w:ilvl w:val="0"/>
-          <w:numId w:val="2"/>
-        </w:numPr>
-        <w:bidi/>
-        <w:spacing w:after="40"/>
-      </w:pPr>
-      <w:r>
-        <w:t xml:space="preserve">בגרסה זו לא מעתיקים. בעתיד אפשר </w:t>
-      </w:r>
-      <w:proofErr w:type="spellStart"/>
-      <w:r>
-        <w:t>Read</w:t>
-      </w:r>
-      <w:r>
-        <w:t>model</w:t>
-      </w:r>
-      <w:proofErr w:type="spellEnd"/>
-      <w:r>
-        <w:t xml:space="preserve"> מינימלי שמוזן מאירועים, עם הצפנה </w:t>
-      </w:r>
-      <w:proofErr w:type="spellStart"/>
-      <w:r>
-        <w:t>ו</w:t>
-      </w:r>
-      <w:r>
-        <w:t>Retention</w:t>
-      </w:r>
-      <w:proofErr w:type="spellEnd"/>
-      <w:r>
-        <w:t xml:space="preserve"> מוגדר.</w:t>
-      </w:r>
-    </w:p>
-    <w:p>
-      <w:pPr>
-        <w:pStyle w:val="2"/>
-        <w:bidi/>
-        <w:spacing w:before="180" w:after="80"/>
-      </w:pPr>
-      <w:r>
-        <w:t>5. הוספת שדה חובה בלי לשבור צרכנים</w:t>
-      </w:r>
-    </w:p>
-    <w:p>
-      <w:pPr>
-        <w:pStyle w:val="a3"/>
-        <w:numPr>
-          <w:ilvl w:val="0"/>
-          <w:numId w:val="2"/>
-        </w:numPr>
-        <w:bidi/>
-        <w:spacing w:after="40"/>
-      </w:pPr>
-      <w:r>
-        <w:t xml:space="preserve">הוספת שדה לתגובה היא שינוי </w:t>
-      </w:r>
-      <w:proofErr w:type="spellStart"/>
-      <w:r>
-        <w:t>תואם</w:t>
-      </w:r>
-      <w:r>
-        <w:t>לאחור</w:t>
-      </w:r>
-      <w:proofErr w:type="spellEnd"/>
-      <w:r>
-        <w:t>, כי צרכנים קיימים מתעלמים משדות לא מוכרים (</w:t>
-      </w:r>
-      <w:proofErr w:type="spellStart"/>
-      <w:r>
-        <w:t>Tolerant</w:t>
-      </w:r>
-      <w:proofErr w:type="spellEnd"/>
-      <w:r>
-        <w:t xml:space="preserve"> </w:t>
-      </w:r>
-      <w:proofErr w:type="spellStart"/>
-      <w:r>
-        <w:t>Reader</w:t>
-      </w:r>
-      <w:proofErr w:type="spellEnd"/>
-      <w:r>
-        <w:t xml:space="preserve">). מעדכנים </w:t>
-      </w:r>
-      <w:proofErr w:type="spellStart"/>
-      <w:r>
-        <w:t>OpenAPI</w:t>
-      </w:r>
-      <w:proofErr w:type="spellEnd"/>
-      <w:r>
-        <w:t xml:space="preserve"> </w:t>
-      </w:r>
-      <w:proofErr w:type="spellStart"/>
-      <w:r>
-        <w:t>ו</w:t>
-      </w:r>
-      <w:r>
-        <w:t>Contract</w:t>
-      </w:r>
-      <w:proofErr w:type="spellEnd"/>
-      <w:r>
-        <w:t xml:space="preserve"> </w:t>
-      </w:r>
-      <w:proofErr w:type="spellStart"/>
-      <w:r>
-        <w:t>tests</w:t>
-      </w:r>
-      <w:proofErr w:type="spellEnd"/>
-      <w:r>
-        <w:t>.</w:t>
-      </w:r>
-    </w:p>
-    <w:p>
-      <w:pPr>
-        <w:pStyle w:val="a3"/>
-        <w:numPr>
-          <w:ilvl w:val="0"/>
-          <w:numId w:val="2"/>
-        </w:numPr>
-        <w:bidi/>
-        <w:spacing w:after="40"/>
-      </w:pPr>
-      <w:r>
-        <w:t xml:space="preserve">שינוי שובר </w:t>
-      </w:r>
-      <w:r>
-        <w:t>-</w:t>
-      </w:r>
-      <w:r>
-        <w:t xml:space="preserve">שדה חובה בקלט, שינוי משמעות או הסרה </w:t>
-      </w:r>
-      <w:r>
-        <w:t>-</w:t>
-      </w:r>
-      <w:r>
-        <w:t>עובר ל</w:t>
-      </w:r>
-      <w:r>
-        <w:t>v2 (‎/</w:t>
-      </w:r>
-      <w:proofErr w:type="spellStart"/>
-      <w:r>
-        <w:t>api</w:t>
-      </w:r>
-      <w:proofErr w:type="spellEnd"/>
-      <w:r>
-        <w:t>/v2/</w:t>
-      </w:r>
-      <w:proofErr w:type="spellStart"/>
-      <w:r>
-        <w:t>my</w:t>
-      </w:r>
-      <w:r>
-        <w:t>requests</w:t>
-      </w:r>
-      <w:proofErr w:type="spellEnd"/>
-      <w:r>
-        <w:t xml:space="preserve"> או </w:t>
-      </w:r>
-      <w:proofErr w:type="spellStart"/>
-      <w:r>
-        <w:t>v</w:t>
-      </w:r>
-      <w:r>
-        <w:t>ersioning</w:t>
-      </w:r>
-      <w:proofErr w:type="spellEnd"/>
-      <w:r>
-        <w:t xml:space="preserve"> </w:t>
-      </w:r>
-      <w:proofErr w:type="spellStart"/>
-      <w:r>
-        <w:t>ב</w:t>
-      </w:r>
-      <w:r>
-        <w:t>Header</w:t>
-      </w:r>
-      <w:proofErr w:type="spellEnd"/>
-      <w:r>
-        <w:t>).</w:t>
-      </w:r>
-    </w:p>
-    <w:p>
-      <w:pPr>
-        <w:pStyle w:val="a3"/>
-        <w:numPr>
-          <w:ilvl w:val="0"/>
-          <w:numId w:val="2"/>
-        </w:numPr>
-        <w:bidi/>
-        <w:spacing w:after="40"/>
-      </w:pPr>
-      <w:r>
-        <w:t xml:space="preserve">גרסה ישנה נתמכת במקביל, עם </w:t>
-      </w:r>
-      <w:proofErr w:type="spellStart"/>
-      <w:r>
-        <w:t>Deprecation</w:t>
-      </w:r>
-      <w:proofErr w:type="spellEnd"/>
-      <w:r>
-        <w:t xml:space="preserve"> </w:t>
-      </w:r>
-      <w:proofErr w:type="spellStart"/>
-      <w:r>
-        <w:t>header</w:t>
-      </w:r>
-      <w:proofErr w:type="spellEnd"/>
-      <w:r>
-        <w:t xml:space="preserve"> ותאריך סיום מתואם עם הצרכנים.</w:t>
-      </w:r>
     </w:p>
     <w:p>
       <w:pPr>

</xml_diff>